<commit_message>
fix: align contract templates with official fonts
</commit_message>
<xml_diff>
--- a/services/api/assets/templates/generic-contract-v1.docx
+++ b/services/api/assets/templates/generic-contract-v1.docx
@@ -9,7 +9,7 @@
       </w:pPr>
       <w:r>
         <w:rPr>
-          <w:rFonts w:ascii="Times New Roman" w:hAnsi="Times New Roman" w:eastAsia="仿宋" w:cs="Times New Roman"/>
+          <w:rFonts w:ascii="Times New Roman" w:hAnsi="Times New Roman" w:eastAsia="仿宋_GB2312" w:cs="Times New Roman"/>
           <w:sz w:val="28"/>
           <w:szCs w:val="28"/>
         </w:rPr>
@@ -71,9 +71,7 @@
       </w:pPr>
       <w:r>
         <w:rPr>
-          <w:rFonts w:ascii="Times New Roman" w:hAnsi="Times New Roman" w:eastAsia="黑体" w:cs="Times New Roman"/>
-          <w:b/>
-          <w:bCs/>
+          <w:rFonts w:ascii="Times New Roman" w:hAnsi="Times New Roman" w:eastAsia="方正小标宋简体" w:cs="Times New Roman"/>
           <w:sz w:val="44"/>
           <w:szCs w:val="44"/>
         </w:rPr>
@@ -118,7 +116,7 @@
       </w:pPr>
       <w:r>
         <w:rPr>
-          <w:rFonts w:ascii="Times New Roman" w:hAnsi="Times New Roman" w:eastAsia="仿宋" w:cs="Times New Roman"/>
+          <w:rFonts w:ascii="Times New Roman" w:hAnsi="Times New Roman" w:eastAsia="仿宋_GB2312" w:cs="Times New Roman"/>
           <w:sz w:val="28"/>
           <w:szCs w:val="28"/>
         </w:rPr>
@@ -131,7 +129,7 @@
       </w:pPr>
       <w:r>
         <w:rPr>
-          <w:rFonts w:ascii="Times New Roman" w:hAnsi="Times New Roman" w:eastAsia="仿宋" w:cs="Times New Roman"/>
+          <w:rFonts w:ascii="Times New Roman" w:hAnsi="Times New Roman" w:eastAsia="仿宋_GB2312" w:cs="Times New Roman"/>
           <w:sz w:val="28"/>
           <w:szCs w:val="28"/>
         </w:rPr>
@@ -144,7 +142,7 @@
       </w:pPr>
       <w:r>
         <w:rPr>
-          <w:rFonts w:ascii="Times New Roman" w:hAnsi="Times New Roman" w:eastAsia="仿宋" w:cs="Times New Roman"/>
+          <w:rFonts w:ascii="Times New Roman" w:hAnsi="Times New Roman" w:eastAsia="仿宋_GB2312" w:cs="Times New Roman"/>
           <w:sz w:val="28"/>
           <w:szCs w:val="28"/>
         </w:rPr>
@@ -157,7 +155,7 @@
       </w:pPr>
       <w:r>
         <w:rPr>
-          <w:rFonts w:ascii="Times New Roman" w:hAnsi="Times New Roman" w:eastAsia="仿宋" w:cs="Times New Roman"/>
+          <w:rFonts w:ascii="Times New Roman" w:hAnsi="Times New Roman" w:eastAsia="仿宋_GB2312" w:cs="Times New Roman"/>
           <w:sz w:val="28"/>
           <w:szCs w:val="28"/>
         </w:rPr>
@@ -246,9 +244,7 @@
       </w:pPr>
       <w:r>
         <w:rPr>
-          <w:rFonts w:ascii="Times New Roman" w:hAnsi="Times New Roman" w:eastAsia="黑体" w:cs="Times New Roman"/>
-          <w:b/>
-          <w:bCs/>
+          <w:rFonts w:ascii="Times New Roman" w:hAnsi="Times New Roman" w:eastAsia="方正小标宋简体" w:cs="Times New Roman"/>
           <w:sz w:val="44"/>
           <w:szCs w:val="44"/>
         </w:rPr>
@@ -605,7 +601,7 @@
       <w:jc w:val="both"/>
     </w:pPr>
     <w:rPr>
-      <w:rFonts w:ascii="Times New Roman" w:hAnsi="Times New Roman" w:eastAsia="仿宋" w:cs="Times New Roman"/>
+      <w:rFonts w:ascii="Times New Roman" w:hAnsi="Times New Roman" w:eastAsia="仿宋_GB2312" w:cs="Times New Roman"/>
       <w:sz w:val="28"/>
       <w:szCs w:val="28"/>
     </w:rPr>
@@ -618,9 +614,7 @@
       <w:jc w:val="center"/>
     </w:pPr>
     <w:rPr>
-      <w:rFonts w:ascii="Times New Roman" w:hAnsi="Times New Roman" w:eastAsia="黑体" w:cs="Times New Roman"/>
-      <w:b/>
-      <w:bCs/>
+      <w:rFonts w:ascii="Times New Roman" w:hAnsi="Times New Roman" w:eastAsia="方正小标宋简体" w:cs="Times New Roman"/>
       <w:sz w:val="44"/>
       <w:szCs w:val="44"/>
     </w:rPr>
@@ -633,7 +627,7 @@
       <w:ind w:firstLineChars="0"/>
     </w:pPr>
     <w:rPr>
-      <w:rFonts w:ascii="Times New Roman" w:hAnsi="Times New Roman" w:eastAsia="仿宋" w:cs="Times New Roman"/>
+      <w:rFonts w:ascii="Times New Roman" w:hAnsi="Times New Roman" w:eastAsia="仿宋_GB2312" w:cs="Times New Roman"/>
       <w:sz w:val="28"/>
       <w:szCs w:val="28"/>
     </w:rPr>

</xml_diff>